<commit_message>
docs(lab4): embed quality engineering diagrams
</commit_message>
<xml_diff>
--- a/实验四_软件质量工程与AI辅助代码审查/01_测试计划与策略.docx
+++ b/实验四_软件质量工程与AI辅助代码审查/01_测试计划与策略.docx
@@ -1765,6 +1765,66 @@
       </w:tr>
     </w:tbl>
     <w:p/>
+    <w:p>
+      <w:r>
+        <w:br w:type="page"/>
+      </w:r>
+    </w:p>
+    <w:p>
+      <w:pPr>
+        <w:pStyle w:val="Heading1"/>
+      </w:pPr>
+      <w:r>
+        <w:t>图示补充（本次补图）</w:t>
+      </w:r>
+    </w:p>
+    <w:p>
+      <w:pPr>
+        <w:jc w:val="center"/>
+      </w:pPr>
+      <w:r>
+        <w:drawing>
+          <wp:inline xmlns:a="http://schemas.openxmlformats.org/drawingml/2006/main" xmlns:pic="http://schemas.openxmlformats.org/drawingml/2006/picture">
+            <wp:extent cx="5760720" cy="3420427"/>
+            <wp:docPr id="1" name="Picture 1"/>
+            <wp:cNvGraphicFramePr>
+              <a:graphicFrameLocks noChangeAspect="1"/>
+            </wp:cNvGraphicFramePr>
+            <a:graphic>
+              <a:graphicData uri="http://schemas.openxmlformats.org/drawingml/2006/picture">
+                <pic:pic>
+                  <pic:nvPicPr>
+                    <pic:cNvPr id="0" name="lab4_test_pyramid.png"/>
+                    <pic:cNvPicPr/>
+                  </pic:nvPicPr>
+                  <pic:blipFill>
+                    <a:blip r:embed="rId9"/>
+                    <a:stretch>
+                      <a:fillRect/>
+                    </a:stretch>
+                  </pic:blipFill>
+                  <pic:spPr>
+                    <a:xfrm>
+                      <a:off x="0" y="0"/>
+                      <a:ext cx="5760720" cy="3420427"/>
+                    </a:xfrm>
+                    <a:prstGeom prst="rect"/>
+                  </pic:spPr>
+                </pic:pic>
+              </a:graphicData>
+            </a:graphic>
+          </wp:inline>
+        </w:drawing>
+      </w:r>
+    </w:p>
+    <w:p>
+      <w:pPr>
+        <w:jc w:val="center"/>
+      </w:pPr>
+      <w:r>
+        <w:t>图4-1 测试金字塔与质量门禁</w:t>
+      </w:r>
+    </w:p>
     <w:sectPr>
       <w:pgSz w:w="12240" w:h="15840"/>
       <w:pgMar w:top="1134" w:right="1247" w:bottom="1134" w:left="1247" w:header="720" w:footer="720" w:gutter="0"/>

</xml_diff>

<commit_message>
docs(lab4): position diagrams in template sections
</commit_message>
<xml_diff>
--- a/实验四_软件质量工程与AI辅助代码审查/01_测试计划与策略.docx
+++ b/实验四_软件质量工程与AI辅助代码审查/01_测试计划与策略.docx
@@ -631,6 +631,58 @@
           <w:p>
             <w:r>
               <w:t>静态检查：ruff/eslint、AI Review、Secrets 扫描和依赖扫描作为测试奖杯底座。</w:t>
+            </w:r>
+          </w:p>
+          <w:p>
+            <w:pPr>
+              <w:spacing w:before="0" w:after="0"/>
+            </w:pPr>
+          </w:p>
+          <w:p>
+            <w:pPr>
+              <w:jc w:val="center"/>
+            </w:pPr>
+            <w:r>
+              <w:drawing>
+                <wp:inline xmlns:a="http://schemas.openxmlformats.org/drawingml/2006/main" xmlns:pic="http://schemas.openxmlformats.org/drawingml/2006/picture">
+                  <wp:extent cx="4983480" cy="2958941"/>
+                  <wp:docPr id="1" name="Picture 1"/>
+                  <wp:cNvGraphicFramePr>
+                    <a:graphicFrameLocks noChangeAspect="1"/>
+                  </wp:cNvGraphicFramePr>
+                  <a:graphic>
+                    <a:graphicData uri="http://schemas.openxmlformats.org/drawingml/2006/picture">
+                      <pic:pic>
+                        <pic:nvPicPr>
+                          <pic:cNvPr id="0" name="image.png"/>
+                          <pic:cNvPicPr/>
+                        </pic:nvPicPr>
+                        <pic:blipFill>
+                          <a:blip r:embed="rId9"/>
+                          <a:stretch>
+                            <a:fillRect/>
+                          </a:stretch>
+                        </pic:blipFill>
+                        <pic:spPr>
+                          <a:xfrm>
+                            <a:off x="0" y="0"/>
+                            <a:ext cx="4983480" cy="2958941"/>
+                          </a:xfrm>
+                          <a:prstGeom prst="rect"/>
+                        </pic:spPr>
+                      </pic:pic>
+                    </a:graphicData>
+                  </a:graphic>
+                </wp:inline>
+              </w:drawing>
+            </w:r>
+          </w:p>
+          <w:p>
+            <w:pPr>
+              <w:jc w:val="center"/>
+            </w:pPr>
+            <w:r>
+              <w:t>图4-1 测试金字塔与质量门禁</w:t>
             </w:r>
           </w:p>
         </w:tc>
@@ -1765,66 +1817,6 @@
       </w:tr>
     </w:tbl>
     <w:p/>
-    <w:p>
-      <w:r>
-        <w:br w:type="page"/>
-      </w:r>
-    </w:p>
-    <w:p>
-      <w:pPr>
-        <w:pStyle w:val="Heading1"/>
-      </w:pPr>
-      <w:r>
-        <w:t>图示补充（本次补图）</w:t>
-      </w:r>
-    </w:p>
-    <w:p>
-      <w:pPr>
-        <w:jc w:val="center"/>
-      </w:pPr>
-      <w:r>
-        <w:drawing>
-          <wp:inline xmlns:a="http://schemas.openxmlformats.org/drawingml/2006/main" xmlns:pic="http://schemas.openxmlformats.org/drawingml/2006/picture">
-            <wp:extent cx="5760720" cy="3420427"/>
-            <wp:docPr id="1" name="Picture 1"/>
-            <wp:cNvGraphicFramePr>
-              <a:graphicFrameLocks noChangeAspect="1"/>
-            </wp:cNvGraphicFramePr>
-            <a:graphic>
-              <a:graphicData uri="http://schemas.openxmlformats.org/drawingml/2006/picture">
-                <pic:pic>
-                  <pic:nvPicPr>
-                    <pic:cNvPr id="0" name="lab4_test_pyramid.png"/>
-                    <pic:cNvPicPr/>
-                  </pic:nvPicPr>
-                  <pic:blipFill>
-                    <a:blip r:embed="rId9"/>
-                    <a:stretch>
-                      <a:fillRect/>
-                    </a:stretch>
-                  </pic:blipFill>
-                  <pic:spPr>
-                    <a:xfrm>
-                      <a:off x="0" y="0"/>
-                      <a:ext cx="5760720" cy="3420427"/>
-                    </a:xfrm>
-                    <a:prstGeom prst="rect"/>
-                  </pic:spPr>
-                </pic:pic>
-              </a:graphicData>
-            </a:graphic>
-          </wp:inline>
-        </w:drawing>
-      </w:r>
-    </w:p>
-    <w:p>
-      <w:pPr>
-        <w:jc w:val="center"/>
-      </w:pPr>
-      <w:r>
-        <w:t>图4-1 测试金字塔与质量门禁</w:t>
-      </w:r>
-    </w:p>
     <w:sectPr>
       <w:pgSz w:w="12240" w:h="15840"/>
       <w:pgMar w:top="1134" w:right="1247" w:bottom="1134" w:left="1247" w:header="720" w:footer="720" w:gutter="0"/>

</xml_diff>